<commit_message>
fix: McKinsey→MCK in all report output
</commit_message>
<xml_diff>
--- a/output/日世战略诊断报告.docx
+++ b/output/日世战略诊断报告.docx
@@ -13,7 +13,7 @@
           <w:color w:val="051C2C"/>
           <w:sz w:val="44"/>
         </w:rPr>
-        <w:t>McKinsey 10 Tests</w:t>
+        <w:t>MCK 10 Tests</w:t>
       </w:r>
     </w:p>
     <w:p>
@@ -2236,7 +2236,7 @@
           <w:color w:val="A0A0A0"/>
           <w:sz w:val="16"/>
         </w:rPr>
-        <w:t>McKinsey Strategic 10 Tests · 初始想法梳理，非最终结论</w:t>
+        <w:t>MCK Strategic 10 Tests · 初始想法梳理，非最终结论</w:t>
       </w:r>
     </w:p>
     <w:p>

</xml_diff>